<commit_message>
Pequeno ajuste de formatação - Primeira versão do artigo concluída
</commit_message>
<xml_diff>
--- a/Dados_demo_prev_Ana_Anderson.docx
+++ b/Dados_demo_prev_Ana_Anderson.docx
@@ -947,6 +947,19 @@
     </w:p>
     <w:p>
       <w:pPr>
+        <w:jc w:val="both"/>
+        <w:rPr>
+          <w:rFonts w:ascii="Arial" w:eastAsia="Times New Roman" w:hAnsi="Arial" w:cs="Arial"/>
+          <w:iCs/>
+          <w:color w:val="000000" w:themeColor="text1"/>
+          <w:sz w:val="24"/>
+          <w:szCs w:val="24"/>
+          <w:lang w:val="pt-BR" w:eastAsia="pt-BR"/>
+        </w:rPr>
+      </w:pPr>
+    </w:p>
+    <w:p>
+      <w:pPr>
         <w:pStyle w:val="Ttulo2"/>
         <w:numPr>
           <w:ilvl w:val="1"/>
@@ -1462,6 +1475,7 @@
           <w:szCs w:val="24"/>
           <w:lang w:eastAsia="pt-BR"/>
         </w:rPr>
+        <w:lastRenderedPageBreak/>
         <w:t>utilizando</w:t>
       </w:r>
       <w:proofErr w:type="spellEnd"/>
@@ -1558,7 +1572,6 @@
           <w:szCs w:val="24"/>
           <w:lang w:eastAsia="pt-BR"/>
         </w:rPr>
-        <w:lastRenderedPageBreak/>
         <w:t>projeções</w:t>
       </w:r>
       <w:proofErr w:type="spellEnd"/>
@@ -2249,31 +2262,6 @@
     </w:p>
     <w:p>
       <w:pPr>
-        <w:rPr>
-          <w:rFonts w:ascii="Arial" w:eastAsia="Times New Roman" w:hAnsi="Arial" w:cs="Arial"/>
-          <w:iCs/>
-          <w:color w:val="000000" w:themeColor="text1"/>
-          <w:sz w:val="24"/>
-          <w:szCs w:val="24"/>
-          <w:lang w:val="pt-BR" w:eastAsia="pt-BR"/>
-        </w:rPr>
-      </w:pPr>
-    </w:p>
-    <w:p>
-      <w:pPr>
-        <w:rPr>
-          <w:rFonts w:ascii="Arial" w:eastAsia="Times New Roman" w:hAnsi="Arial" w:cs="Arial"/>
-          <w:i/>
-          <w:iCs/>
-          <w:color w:val="000000" w:themeColor="text1"/>
-          <w:sz w:val="24"/>
-          <w:szCs w:val="24"/>
-          <w:lang w:val="pt-BR" w:eastAsia="pt-BR"/>
-        </w:rPr>
-      </w:pPr>
-    </w:p>
-    <w:p>
-      <w:pPr>
         <w:pStyle w:val="Ttulo1"/>
         <w:numPr>
           <w:ilvl w:val="0"/>
@@ -2290,6 +2278,7 @@
           <w:rFonts w:ascii="Arial" w:hAnsi="Arial" w:cs="Arial"/>
           <w:szCs w:val="24"/>
         </w:rPr>
+        <w:lastRenderedPageBreak/>
         <w:t>RESULTADOS E DISCUSSÕES</w:t>
       </w:r>
     </w:p>
@@ -2641,7 +2630,7 @@
           <w:szCs w:val="24"/>
           <w:lang w:val="pt-BR"/>
         </w:rPr>
-        <w:t xml:space="preserve">Ao considerar as projeções demográficas, observa-se uma mudança mais acentuada nas próximas décadas. Entre 2023 e 2070, a população de 15 a 64 anos apresenta redução projetada de 22,39%, enquanto a população com 60 anos ou mais aumenta 128,29%. No mesmo período, a participação da população de 15 a 64 anos passa de aproximadamente 69% para 57% da população, enquanto a parcela com 60 anos ou </w:t>
+        <w:t xml:space="preserve">Ao considerar as projeções demográficas, observa-se uma mudança mais acentuada nas próximas décadas. Entre 2023 e 2070, a população de 15 a 64 anos apresenta redução projetada de 22,39%, enquanto a população com 60 anos ou mais aumenta 128,29%. No mesmo período, a participação da população de 15 a 64 anos passa de aproximadamente 69% para 57% da população, enquanto a parcela com 60 anos ou mais passa de 16% para 38%. Esses resultados indicam uma mudança significativa </w:t>
       </w:r>
       <w:r>
         <w:rPr>
@@ -2652,7 +2641,7 @@
           <w:lang w:val="pt-BR"/>
         </w:rPr>
         <w:lastRenderedPageBreak/>
-        <w:t>mais passa de 16% para 38%. Esses resultados indicam uma mudança significativa na proporção entre a população em idade potencialmente ativa e a população idosa.</w:t>
+        <w:t>na proporção entre a população em idade potencialmente ativa e a população idosa.</w:t>
       </w:r>
     </w:p>
     <w:p>
@@ -2945,14 +2934,14 @@
         <w:rPr>
           <w:rFonts w:ascii="Arial" w:eastAsia="Meiryo" w:hAnsi="Arial" w:cs="Arial"/>
         </w:rPr>
-        <w:t xml:space="preserve">Diante do aumento da longevidade e das transformações demográficas observadas, os resultados também reforçam a relevância de ampliar a discussão </w:t>
+        <w:t xml:space="preserve">Diante do aumento da longevidade e das transformações demográficas observadas, os resultados também reforçam a relevância de ampliar a discussão sobre planejamento financeiro de longo prazo e diversificação das fontes de renda </w:t>
       </w:r>
       <w:r>
         <w:rPr>
           <w:rFonts w:ascii="Arial" w:eastAsia="Meiryo" w:hAnsi="Arial" w:cs="Arial"/>
         </w:rPr>
         <w:lastRenderedPageBreak/>
-        <w:t>sobre planejamento financeiro de longo prazo e diversificação das fontes de renda para a aposentadoria, reduzindo a dependência exclusiva de uma única fonte de renda no futuro.</w:t>
+        <w:t>para a aposentadoria, reduzindo a dependência exclusiva de uma única fonte de renda no futuro.</w:t>
       </w:r>
     </w:p>
     <w:p>
@@ -3046,51 +3035,7 @@
             <w:szCs w:val="24"/>
             <w:lang w:val="pt-BR"/>
           </w:rPr>
-          <w:t>AEPS 2024 — Ministério da</w:t>
-        </w:r>
-        <w:r>
-          <w:rPr>
-            <w:rStyle w:val="Hyperlink"/>
-            <w:rFonts w:ascii="Arial" w:hAnsi="Arial" w:cs="Arial"/>
-            <w:iCs/>
-            <w:sz w:val="24"/>
-            <w:szCs w:val="24"/>
-            <w:lang w:val="pt-BR"/>
-          </w:rPr>
-          <w:t xml:space="preserve"> </w:t>
-        </w:r>
-        <w:r>
-          <w:rPr>
-            <w:rStyle w:val="Hyperlink"/>
-            <w:rFonts w:ascii="Arial" w:hAnsi="Arial" w:cs="Arial"/>
-            <w:iCs/>
-            <w:sz w:val="24"/>
-            <w:szCs w:val="24"/>
-            <w:lang w:val="pt-BR"/>
-          </w:rPr>
-          <w:t xml:space="preserve">Previdência </w:t>
-        </w:r>
-        <w:r>
-          <w:rPr>
-            <w:rStyle w:val="Hyperlink"/>
-            <w:rFonts w:ascii="Arial" w:hAnsi="Arial" w:cs="Arial"/>
-            <w:iCs/>
-            <w:sz w:val="24"/>
-            <w:szCs w:val="24"/>
-            <w:lang w:val="pt-BR"/>
-          </w:rPr>
-          <w:t>S</w:t>
-        </w:r>
-        <w:r>
-          <w:rPr>
-            <w:rStyle w:val="Hyperlink"/>
-            <w:rFonts w:ascii="Arial" w:hAnsi="Arial" w:cs="Arial"/>
-            <w:iCs/>
-            <w:sz w:val="24"/>
-            <w:szCs w:val="24"/>
-            <w:lang w:val="pt-BR"/>
-          </w:rPr>
-          <w:t>ocial</w:t>
+          <w:t>AEPS 2024 — Ministério da Previdência Social</w:t>
         </w:r>
       </w:hyperlink>
       <w:r>
@@ -3178,51 +3123,7 @@
             <w:szCs w:val="24"/>
             <w:lang w:val="pt-BR"/>
           </w:rPr>
-          <w:t>Anuários da Previdê</w:t>
-        </w:r>
-        <w:r>
-          <w:rPr>
-            <w:rStyle w:val="Hyperlink"/>
-            <w:rFonts w:ascii="Arial" w:hAnsi="Arial" w:cs="Arial"/>
-            <w:iCs/>
-            <w:sz w:val="24"/>
-            <w:szCs w:val="24"/>
-            <w:lang w:val="pt-BR"/>
-          </w:rPr>
-          <w:t>n</w:t>
-        </w:r>
-        <w:r>
-          <w:rPr>
-            <w:rStyle w:val="Hyperlink"/>
-            <w:rFonts w:ascii="Arial" w:hAnsi="Arial" w:cs="Arial"/>
-            <w:iCs/>
-            <w:sz w:val="24"/>
-            <w:szCs w:val="24"/>
-            <w:lang w:val="pt-BR"/>
-          </w:rPr>
-          <w:t>cia So</w:t>
-        </w:r>
-        <w:r>
-          <w:rPr>
-            <w:rStyle w:val="Hyperlink"/>
-            <w:rFonts w:ascii="Arial" w:hAnsi="Arial" w:cs="Arial"/>
-            <w:iCs/>
-            <w:sz w:val="24"/>
-            <w:szCs w:val="24"/>
-            <w:lang w:val="pt-BR"/>
-          </w:rPr>
-          <w:t>c</w:t>
-        </w:r>
-        <w:r>
-          <w:rPr>
-            <w:rStyle w:val="Hyperlink"/>
-            <w:rFonts w:ascii="Arial" w:hAnsi="Arial" w:cs="Arial"/>
-            <w:iCs/>
-            <w:sz w:val="24"/>
-            <w:szCs w:val="24"/>
-            <w:lang w:val="pt-BR"/>
-          </w:rPr>
-          <w:t>ial — Ministério da Previdência Social</w:t>
+          <w:t>Anuários da Previdência Social — Ministério da Previdência Social</w:t>
         </w:r>
       </w:hyperlink>
       <w:r>
@@ -3310,62 +3211,7 @@
             <w:szCs w:val="24"/>
             <w:lang w:val="pt-BR"/>
           </w:rPr>
-          <w:t xml:space="preserve">Projeções </w:t>
-        </w:r>
-        <w:r>
-          <w:rPr>
-            <w:rStyle w:val="Hyperlink"/>
-            <w:rFonts w:ascii="Arial" w:hAnsi="Arial" w:cs="Arial"/>
-            <w:iCs/>
-            <w:sz w:val="24"/>
-            <w:szCs w:val="24"/>
-            <w:lang w:val="pt-BR"/>
-          </w:rPr>
-          <w:t>d</w:t>
-        </w:r>
-        <w:r>
-          <w:rPr>
-            <w:rStyle w:val="Hyperlink"/>
-            <w:rFonts w:ascii="Arial" w:hAnsi="Arial" w:cs="Arial"/>
-            <w:iCs/>
-            <w:sz w:val="24"/>
-            <w:szCs w:val="24"/>
-            <w:lang w:val="pt-BR"/>
-          </w:rPr>
-          <w:t>a</w:t>
-        </w:r>
-        <w:r>
-          <w:rPr>
-            <w:rStyle w:val="Hyperlink"/>
-            <w:rFonts w:ascii="Arial" w:hAnsi="Arial" w:cs="Arial"/>
-            <w:iCs/>
-            <w:sz w:val="24"/>
-            <w:szCs w:val="24"/>
-            <w:lang w:val="pt-BR"/>
-          </w:rPr>
-          <w:t xml:space="preserve"> População</w:t>
-        </w:r>
-        <w:r>
-          <w:rPr>
-            <w:rStyle w:val="Hyperlink"/>
-            <w:rFonts w:ascii="Arial" w:hAnsi="Arial" w:cs="Arial"/>
-            <w:iCs/>
-            <w:sz w:val="24"/>
-            <w:szCs w:val="24"/>
-            <w:lang w:val="pt-BR"/>
-          </w:rPr>
-          <w:t xml:space="preserve"> </w:t>
-        </w:r>
-        <w:r>
-          <w:rPr>
-            <w:rStyle w:val="Hyperlink"/>
-            <w:rFonts w:ascii="Arial" w:hAnsi="Arial" w:cs="Arial"/>
-            <w:iCs/>
-            <w:sz w:val="24"/>
-            <w:szCs w:val="24"/>
-            <w:lang w:val="pt-BR"/>
-          </w:rPr>
-          <w:t>— IBGE</w:t>
+          <w:t>Projeções da População — IBGE</w:t>
         </w:r>
       </w:hyperlink>
       <w:r>
@@ -4887,6 +4733,16 @@
               <w:t>xxxxxxx</w:t>
             </w:r>
             <w:proofErr w:type="spellEnd"/>
+          </w:p>
+          <w:p>
+            <w:pPr>
+              <w:jc w:val="both"/>
+              <w:rPr>
+                <w:rFonts w:ascii="Arial" w:hAnsi="Arial" w:cs="Arial"/>
+                <w:sz w:val="24"/>
+                <w:szCs w:val="24"/>
+              </w:rPr>
+            </w:pPr>
           </w:p>
           <w:p>
             <w:pPr>
@@ -6260,268 +6116,26 @@
         </w:rPr>
         <w:t xml:space="preserve"> </w:t>
       </w:r>
-      <w:proofErr w:type="spellStart"/>
       <w:r>
         <w:rPr>
           <w:rFonts w:asciiTheme="minorHAnsi" w:hAnsiTheme="minorHAnsi" w:cs="Arial"/>
           <w:lang w:val="en-US"/>
         </w:rPr>
-        <w:t>Graduado</w:t>
-      </w:r>
-      <w:proofErr w:type="spellEnd"/>
+        <w:t>Graduado em Engenharia de Produção Mecânica pelo Centro Universitário das Faculdades Metropolitanas Unidas (FMU) e graduando em Inteligência e</w:t>
+      </w:r>
       <w:r>
         <w:rPr>
           <w:rFonts w:asciiTheme="minorHAnsi" w:hAnsiTheme="minorHAnsi" w:cs="Arial"/>
           <w:lang w:val="en-US"/>
         </w:rPr>
-        <w:t xml:space="preserve"> </w:t>
-      </w:r>
-      <w:proofErr w:type="spellStart"/>
+        <w:t>m</w:t>
+      </w:r>
       <w:r>
         <w:rPr>
           <w:rFonts w:asciiTheme="minorHAnsi" w:hAnsiTheme="minorHAnsi" w:cs="Arial"/>
           <w:lang w:val="en-US"/>
         </w:rPr>
-        <w:t>em</w:t>
-      </w:r>
-      <w:proofErr w:type="spellEnd"/>
-      <w:r>
-        <w:rPr>
-          <w:rFonts w:asciiTheme="minorHAnsi" w:hAnsiTheme="minorHAnsi" w:cs="Arial"/>
-          <w:lang w:val="en-US"/>
-        </w:rPr>
-        <w:t xml:space="preserve"> </w:t>
-      </w:r>
-      <w:proofErr w:type="spellStart"/>
-      <w:r>
-        <w:rPr>
-          <w:rFonts w:asciiTheme="minorHAnsi" w:hAnsiTheme="minorHAnsi" w:cs="Arial"/>
-          <w:lang w:val="en-US"/>
-        </w:rPr>
-        <w:t>Engenharia</w:t>
-      </w:r>
-      <w:proofErr w:type="spellEnd"/>
-      <w:r>
-        <w:rPr>
-          <w:rFonts w:asciiTheme="minorHAnsi" w:hAnsiTheme="minorHAnsi" w:cs="Arial"/>
-          <w:lang w:val="en-US"/>
-        </w:rPr>
-        <w:t xml:space="preserve"> de </w:t>
-      </w:r>
-      <w:proofErr w:type="spellStart"/>
-      <w:r>
-        <w:rPr>
-          <w:rFonts w:asciiTheme="minorHAnsi" w:hAnsiTheme="minorHAnsi" w:cs="Arial"/>
-          <w:lang w:val="en-US"/>
-        </w:rPr>
-        <w:t>Produção</w:t>
-      </w:r>
-      <w:proofErr w:type="spellEnd"/>
-      <w:r>
-        <w:rPr>
-          <w:rFonts w:asciiTheme="minorHAnsi" w:hAnsiTheme="minorHAnsi" w:cs="Arial"/>
-          <w:lang w:val="en-US"/>
-        </w:rPr>
-        <w:t xml:space="preserve"> </w:t>
-      </w:r>
-      <w:proofErr w:type="spellStart"/>
-      <w:r>
-        <w:rPr>
-          <w:rFonts w:asciiTheme="minorHAnsi" w:hAnsiTheme="minorHAnsi" w:cs="Arial"/>
-          <w:lang w:val="en-US"/>
-        </w:rPr>
-        <w:t>Mecânica</w:t>
-      </w:r>
-      <w:proofErr w:type="spellEnd"/>
-      <w:r>
-        <w:rPr>
-          <w:rFonts w:asciiTheme="minorHAnsi" w:hAnsiTheme="minorHAnsi" w:cs="Arial"/>
-          <w:lang w:val="en-US"/>
-        </w:rPr>
-        <w:t xml:space="preserve"> </w:t>
-      </w:r>
-      <w:proofErr w:type="spellStart"/>
-      <w:r>
-        <w:rPr>
-          <w:rFonts w:asciiTheme="minorHAnsi" w:hAnsiTheme="minorHAnsi" w:cs="Arial"/>
-          <w:lang w:val="en-US"/>
-        </w:rPr>
-        <w:t>pelo</w:t>
-      </w:r>
-      <w:proofErr w:type="spellEnd"/>
-      <w:r>
-        <w:rPr>
-          <w:rFonts w:asciiTheme="minorHAnsi" w:hAnsiTheme="minorHAnsi" w:cs="Arial"/>
-          <w:lang w:val="en-US"/>
-        </w:rPr>
-        <w:t xml:space="preserve"> Centro Universitário das </w:t>
-      </w:r>
-      <w:proofErr w:type="spellStart"/>
-      <w:r>
-        <w:rPr>
-          <w:rFonts w:asciiTheme="minorHAnsi" w:hAnsiTheme="minorHAnsi" w:cs="Arial"/>
-          <w:lang w:val="en-US"/>
-        </w:rPr>
-        <w:t>Faculdades</w:t>
-      </w:r>
-      <w:proofErr w:type="spellEnd"/>
-      <w:r>
-        <w:rPr>
-          <w:rFonts w:asciiTheme="minorHAnsi" w:hAnsiTheme="minorHAnsi" w:cs="Arial"/>
-          <w:lang w:val="en-US"/>
-        </w:rPr>
-        <w:t xml:space="preserve"> </w:t>
-      </w:r>
-      <w:proofErr w:type="spellStart"/>
-      <w:r>
-        <w:rPr>
-          <w:rFonts w:asciiTheme="minorHAnsi" w:hAnsiTheme="minorHAnsi" w:cs="Arial"/>
-          <w:lang w:val="en-US"/>
-        </w:rPr>
-        <w:t>Metropolitanas</w:t>
-      </w:r>
-      <w:proofErr w:type="spellEnd"/>
-      <w:r>
-        <w:rPr>
-          <w:rFonts w:asciiTheme="minorHAnsi" w:hAnsiTheme="minorHAnsi" w:cs="Arial"/>
-          <w:lang w:val="en-US"/>
-        </w:rPr>
-        <w:t xml:space="preserve"> Unidas (FMU) e </w:t>
-      </w:r>
-      <w:proofErr w:type="spellStart"/>
-      <w:r>
-        <w:rPr>
-          <w:rFonts w:asciiTheme="minorHAnsi" w:hAnsiTheme="minorHAnsi" w:cs="Arial"/>
-          <w:lang w:val="en-US"/>
-        </w:rPr>
-        <w:t>graduando</w:t>
-      </w:r>
-      <w:proofErr w:type="spellEnd"/>
-      <w:r>
-        <w:rPr>
-          <w:rFonts w:asciiTheme="minorHAnsi" w:hAnsiTheme="minorHAnsi" w:cs="Arial"/>
-          <w:lang w:val="en-US"/>
-        </w:rPr>
-        <w:t xml:space="preserve"> </w:t>
-      </w:r>
-      <w:proofErr w:type="spellStart"/>
-      <w:r>
-        <w:rPr>
-          <w:rFonts w:asciiTheme="minorHAnsi" w:hAnsiTheme="minorHAnsi" w:cs="Arial"/>
-          <w:lang w:val="en-US"/>
-        </w:rPr>
-        <w:t>em</w:t>
-      </w:r>
-      <w:proofErr w:type="spellEnd"/>
-      <w:r>
-        <w:rPr>
-          <w:rFonts w:asciiTheme="minorHAnsi" w:hAnsiTheme="minorHAnsi" w:cs="Arial"/>
-          <w:lang w:val="en-US"/>
-        </w:rPr>
-        <w:t xml:space="preserve"> </w:t>
-      </w:r>
-      <w:proofErr w:type="spellStart"/>
-      <w:r>
-        <w:rPr>
-          <w:rFonts w:asciiTheme="minorHAnsi" w:hAnsiTheme="minorHAnsi" w:cs="Arial"/>
-          <w:lang w:val="en-US"/>
-        </w:rPr>
-        <w:t>Inteligência</w:t>
-      </w:r>
-      <w:proofErr w:type="spellEnd"/>
-      <w:r>
-        <w:rPr>
-          <w:rFonts w:asciiTheme="minorHAnsi" w:hAnsiTheme="minorHAnsi" w:cs="Arial"/>
-          <w:lang w:val="en-US"/>
-        </w:rPr>
-        <w:t xml:space="preserve"> </w:t>
-      </w:r>
-      <w:proofErr w:type="spellStart"/>
-      <w:r>
-        <w:rPr>
-          <w:rFonts w:asciiTheme="minorHAnsi" w:hAnsiTheme="minorHAnsi" w:cs="Arial"/>
-          <w:lang w:val="en-US"/>
-        </w:rPr>
-        <w:t>e</w:t>
-      </w:r>
-      <w:r>
-        <w:rPr>
-          <w:rFonts w:asciiTheme="minorHAnsi" w:hAnsiTheme="minorHAnsi" w:cs="Arial"/>
-          <w:lang w:val="en-US"/>
-        </w:rPr>
-        <w:t>m</w:t>
-      </w:r>
-      <w:proofErr w:type="spellEnd"/>
-      <w:r>
-        <w:rPr>
-          <w:rFonts w:asciiTheme="minorHAnsi" w:hAnsiTheme="minorHAnsi" w:cs="Arial"/>
-          <w:lang w:val="en-US"/>
-        </w:rPr>
-        <w:t xml:space="preserve"> </w:t>
-      </w:r>
-      <w:proofErr w:type="spellStart"/>
-      <w:r>
-        <w:rPr>
-          <w:rFonts w:asciiTheme="minorHAnsi" w:hAnsiTheme="minorHAnsi" w:cs="Arial"/>
-          <w:lang w:val="en-US"/>
-        </w:rPr>
-        <w:t>Análise</w:t>
-      </w:r>
-      <w:proofErr w:type="spellEnd"/>
-      <w:r>
-        <w:rPr>
-          <w:rFonts w:asciiTheme="minorHAnsi" w:hAnsiTheme="minorHAnsi" w:cs="Arial"/>
-          <w:lang w:val="en-US"/>
-        </w:rPr>
-        <w:t xml:space="preserve"> de Dados pela </w:t>
-      </w:r>
-      <w:proofErr w:type="spellStart"/>
-      <w:r>
-        <w:rPr>
-          <w:rFonts w:asciiTheme="minorHAnsi" w:hAnsiTheme="minorHAnsi" w:cs="Arial"/>
-          <w:lang w:val="en-US"/>
-        </w:rPr>
-        <w:t>Faculdade</w:t>
-      </w:r>
-      <w:proofErr w:type="spellEnd"/>
-      <w:r>
-        <w:rPr>
-          <w:rFonts w:asciiTheme="minorHAnsi" w:hAnsiTheme="minorHAnsi" w:cs="Arial"/>
-          <w:lang w:val="en-US"/>
-        </w:rPr>
-        <w:t xml:space="preserve"> SENAI de </w:t>
-      </w:r>
-      <w:proofErr w:type="spellStart"/>
-      <w:r>
-        <w:rPr>
-          <w:rFonts w:asciiTheme="minorHAnsi" w:hAnsiTheme="minorHAnsi" w:cs="Arial"/>
-          <w:lang w:val="en-US"/>
-        </w:rPr>
-        <w:t>Tecnologia</w:t>
-      </w:r>
-      <w:proofErr w:type="spellEnd"/>
-      <w:r>
-        <w:rPr>
-          <w:rFonts w:asciiTheme="minorHAnsi" w:hAnsiTheme="minorHAnsi" w:cs="Arial"/>
-          <w:lang w:val="en-US"/>
-        </w:rPr>
-        <w:t xml:space="preserve"> </w:t>
-      </w:r>
-      <w:proofErr w:type="spellStart"/>
-      <w:r>
-        <w:rPr>
-          <w:rFonts w:asciiTheme="minorHAnsi" w:hAnsiTheme="minorHAnsi" w:cs="Arial"/>
-          <w:lang w:val="en-US"/>
-        </w:rPr>
-        <w:t>Mecatrônica</w:t>
-      </w:r>
-      <w:proofErr w:type="spellEnd"/>
-      <w:r>
-        <w:rPr>
-          <w:rFonts w:asciiTheme="minorHAnsi" w:hAnsiTheme="minorHAnsi" w:cs="Arial"/>
-          <w:lang w:val="en-US"/>
-        </w:rPr>
-        <w:t>. E-mail: andersonph84@gmail.com</w:t>
+        <w:t xml:space="preserve"> Análise de Dados pela Faculdade SENAI de Tecnologia Mecatrônica. E-mail: andersonph84@gmail.com</w:t>
       </w:r>
     </w:p>
   </w:footnote>
@@ -7467,6 +7081,7 @@
   <w:style w:type="character" w:default="1" w:styleId="Fontepargpadro">
     <w:name w:val="Default Paragraph Font"/>
     <w:uiPriority w:val="1"/>
+    <w:semiHidden/>
     <w:unhideWhenUsed/>
   </w:style>
   <w:style w:type="table" w:default="1" w:styleId="Tabelanormal">

</xml_diff>